<commit_message>
docs(fase2): reemplaza modelo de datos unificado por diagramas separados (RRHH y User) y actualiza sumativa avance
</commit_message>
<xml_diff>
--- a/Fase 2/Evidencias individuales/Ramirez_Karla_2.5_APT122_Sumativa Avance Fase2_.docx
+++ b/Fase 2/Evidencias individuales/Ramirez_Karla_2.5_APT122_Sumativa Avance Fase2_.docx
@@ -1,5 +1,51 @@
 
-<file path=word/document.xml><?xml version="1.0" encoding="utf-8"?>
+<file path=docProps\app.xml><?xml version="1.0" encoding="utf-8"?>
+<Properties xmlns="http://schemas.openxmlformats.org/officeDocument/2006/extended-properties" xmlns:vt="http://schemas.openxmlformats.org/officeDocument/2006/docPropsVTypes">
+  <Template>Normal.dotm</Template>
+  <TotalTime>20</TotalTime>
+  <Pages>7</Pages>
+  <Words>1064</Words>
+  <Characters>5853</Characters>
+  <Application>Microsoft Office Word</Application>
+  <DocSecurity>0</DocSecurity>
+  <Lines>48</Lines>
+  <Paragraphs>13</Paragraphs>
+  <ScaleCrop>false</ScaleCrop>
+  <HeadingPairs>
+    <vt:vector size="2" baseType="variant">
+      <vt:variant>
+        <vt:lpstr>Título</vt:lpstr>
+      </vt:variant>
+      <vt:variant>
+        <vt:i4>1</vt:i4>
+      </vt:variant>
+    </vt:vector>
+  </HeadingPairs>
+  <TitlesOfParts>
+    <vt:vector size="1" baseType="lpstr">
+      <vt:lpstr/>
+    </vt:vector>
+  </TitlesOfParts>
+  <Company/>
+  <LinksUpToDate>false</LinksUpToDate>
+  <CharactersWithSpaces>6904</CharactersWithSpaces>
+  <SharedDoc>false</SharedDoc>
+  <HyperlinksChanged>false</HyperlinksChanged>
+  <AppVersion>16.0000</AppVersion>
+</Properties>
+</file>
+
+<file path=docProps\core.xml><?xml version="1.0" encoding="utf-8"?>
+<cp:coreProperties xmlns:cp="http://schemas.openxmlformats.org/package/2006/metadata/core-properties" xmlns:dc="http://purl.org/dc/elements/1.1/" xmlns:dcterms="http://purl.org/dc/terms/" xmlns:dcmitype="http://purl.org/dc/dcmitype/" xmlns:xsi="http://www.w3.org/2001/XMLSchema-instance">
+  <dc:creator>Un-named</dc:creator>
+  <cp:lastModifiedBy>KARLA VERONICA RAMIREZ HIDALGO</cp:lastModifiedBy>
+  <cp:revision>4</cp:revision>
+  <dcterms:created xsi:type="dcterms:W3CDTF">2026-10-14T03:35:00Z</dcterms:created>
+  <dcterms:modified xsi:type="dcterms:W3CDTF">2026-10-17T04:13:00Z</dcterms:modified>
+</cp:coreProperties>
+</file>
+
+<file path=word\document.xml><?xml version="1.0" encoding="utf-8"?>
 <w:document xmlns:wpc="http://schemas.microsoft.com/office/word/2010/wordprocessingCanvas" xmlns:cx="http://schemas.microsoft.com/office/drawing/2014/chartex" xmlns:cx1="http://schemas.microsoft.com/office/drawing/2015/9/8/chartex" xmlns:cx2="http://schemas.microsoft.com/office/drawing/2015/10/21/chartex" xmlns:cx3="http://schemas.microsoft.com/office/drawing/2016/5/9/chartex" xmlns:cx4="http://schemas.microsoft.com/office/drawing/2016/5/10/chartex" xmlns:cx5="http://schemas.microsoft.com/office/drawing/2016/5/11/chartex" xmlns:cx6="http://schemas.microsoft.com/office/drawing/2016/5/12/chartex" xmlns:cx7="http://schemas.microsoft.com/office/drawing/2016/5/13/chartex" xmlns:cx8="http://schemas.microsoft.com/office/drawing/2016/5/14/chartex" xmlns:mc="http://schemas.openxmlformats.org/markup-compatibility/2006" xmlns:aink="http://schemas.microsoft.com/office/drawing/2016/ink" xmlns:am3d="http://schemas.microsoft.com/office/drawing/2017/model3d" xmlns:o="urn:schemas-microsoft-com:office:office" xmlns:oel="http://schemas.microsoft.com/office/2019/extlst" xmlns:r="http://schemas.openxmlformats.org/officeDocument/2006/relationships" xmlns:m="http://schemas.openxmlformats.org/officeDocument/2006/math" xmlns:v="urn:schemas-microsoft-com:vml" xmlns:wp14="http://schemas.microsoft.com/office/word/2010/wordprocessingDrawing" xmlns:wp="http://schemas.openxmlformats.org/drawingml/2006/wordprocessingDrawing" xmlns:w10="urn:schemas-microsoft-com:office:word" xmlns:w="http://schemas.openxmlformats.org/wordprocessingml/2006/main" xmlns:w14="http://schemas.microsoft.com/office/word/2010/wordml" xmlns:w15="http://schemas.microsoft.com/office/word/2012/wordml" xmlns:w16cex="http://schemas.microsoft.com/office/word/2018/wordml/cex" xmlns:w16cid="http://schemas.microsoft.com/office/word/2016/wordml/cid" xmlns:w16="http://schemas.microsoft.com/office/word/2018/wordml" xmlns:w16du="http://schemas.microsoft.com/office/word/2023/wordml/word16du" xmlns:w16sdtdh="http://schemas.microsoft.com/office/word/2020/wordml/sdtdatahash" xmlns:w16sdtfl="http://schemas.microsoft.com/office/word/2024/wordml/sdtformatlock" xmlns:w16se="http://schemas.microsoft.com/office/word/2015/wordml/symex" xmlns:wpg="http://schemas.microsoft.com/office/word/2010/wordprocessingGroup" xmlns:wpi="http://schemas.microsoft.com/office/word/2010/wordprocessingInk" xmlns:wne="http://schemas.microsoft.com/office/word/2006/wordml" xmlns:wps="http://schemas.microsoft.com/office/word/2010/wordprocessingShape" mc:Ignorable="w14 w15 w16se w16cid w16 w16cex w16sdtdh w16sdtfl w16du wp14">
   <w:body>
     <w:tbl>
@@ -963,7 +1009,7 @@
                 <w:sz w:val="18"/>
                 <w:szCs w:val="18"/>
               </w:rPr>
-              <w:t>(debi probar con diferentes usuarios uno con permiso para aprobar y otro con permiso para validar, probé estando logueada con el superadmin por eso figura la misma persona).</w:t>
+              <w:t/>
             </w:r>
           </w:p>
           <w:p>
@@ -1182,7 +1228,7 @@
                 <w:sz w:val="20"/>
                 <w:szCs w:val="20"/>
               </w:rPr>
-              <w:t>La corrección del registro del contrato fue la situación más exigente del período: al verificar la implementación contra el sistema de referencia, detecté que el contrato se estaba registrando al aprobarse la solicitud en lugar de al enviarse. Lo enfrenté documentando el problema antes de codificar la solución, para asegurar que el cambio fuera coherente con el resto del sistema. Las pruebas automatizadas confirmaron que nada se rompió al corregirlo.</w:t>
+              <w:t>La corrección del registro del contrato fue la situación más exigente del período: al verificar la implementación contra el proyecto real, detecté que el contrato se estaba registrando al aprobarse la solicitud en lugar de al enviarse. Lo enfrenté documentando el problema antes de codificar la solución, para asegurar que el cambio fuera coherente con el resto del sistema. Las pruebas automatizadas confirmaron que nada se rompió al corregirlo.</w:t>
             </w:r>
           </w:p>
           <w:p>
@@ -1510,7 +1556,7 @@
                 <w:sz w:val="20"/>
                 <w:szCs w:val="20"/>
               </w:rPr>
-              <w:t>Como aspecto positivo de este período destaco la corrección del registro del contrato: al comparar la implementación contra el sistema de referencia, detecté que el contrato se estaba registrando al aprobarse la solicitud, en lugar de al enviarse. Corregirlo antes de que avanzara más el desarrollo evitó una deuda técnica difícil de deshacer. Esto confirma el valor de verificar contra referencias externas, no solo contra los propios criterios de aceptación.</w:t>
+              <w:t>Como aspecto positivo de este período destaco la corrección del registro del contrato: al comparar la implementación contra el proyecto real, detecté que el contrato se estaba registrando al aprobarse la solicitud, en lugar de al enviarse. Corregirlo antes de que avanzara más el desarrollo evitó una deuda técnica difícil de deshacer. Esto confirma el valor de verificar contra referencias externas, no solo contra los propios criterios de aceptación.</w:t>
             </w:r>
           </w:p>
           <w:p>
@@ -1763,7 +1809,7 @@
                 <w:sz w:val="20"/>
                 <w:szCs w:val="20"/>
               </w:rPr>
-              <w:t>Por iniciar</w:t>
+              <w:t>Terminado</w:t>
             </w:r>
           </w:p>
         </w:tc>
@@ -1886,7 +1932,33 @@
 </w:document>
 </file>
 
-<file path=word/numbering.xml><?xml version="1.0" encoding="utf-8"?>
+<file path=word\fontTable.xml><?xml version="1.0" encoding="utf-8"?>
+<w:fonts xmlns:mc="http://schemas.openxmlformats.org/markup-compatibility/2006" xmlns:r="http://schemas.openxmlformats.org/officeDocument/2006/relationships" xmlns:w="http://schemas.openxmlformats.org/wordprocessingml/2006/main" xmlns:w14="http://schemas.microsoft.com/office/word/2010/wordml" xmlns:w15="http://schemas.microsoft.com/office/word/2012/wordml" xmlns:w16cex="http://schemas.microsoft.com/office/word/2018/wordml/cex" xmlns:w16cid="http://schemas.microsoft.com/office/word/2016/wordml/cid" xmlns:w16="http://schemas.microsoft.com/office/word/2018/wordml" xmlns:w16du="http://schemas.microsoft.com/office/word/2023/wordml/word16du" xmlns:w16sdtdh="http://schemas.microsoft.com/office/word/2020/wordml/sdtdatahash" xmlns:w16sdtfl="http://schemas.microsoft.com/office/word/2024/wordml/sdtformatlock" xmlns:w16se="http://schemas.microsoft.com/office/word/2015/wordml/symex" mc:Ignorable="w14 w15 w16se w16cid w16 w16cex w16sdtdh w16sdtfl w16du">
+  <w:font w:name="Calibri">
+    <w:panose1 w:val="020F0502020204030204"/>
+    <w:charset w:val="00"/>
+    <w:family w:val="swiss"/>
+    <w:pitch w:val="variable"/>
+    <w:sig w:usb0="E4002EFF" w:usb1="C200247B" w:usb2="00000009" w:usb3="00000000" w:csb0="000001FF" w:csb1="00000000"/>
+  </w:font>
+  <w:font w:name="Times New Roman">
+    <w:panose1 w:val="02020603050405020304"/>
+    <w:charset w:val="00"/>
+    <w:family w:val="roman"/>
+    <w:pitch w:val="variable"/>
+    <w:sig w:usb0="E0002EFF" w:usb1="C000785B" w:usb2="00000009" w:usb3="00000000" w:csb0="000001FF" w:csb1="00000000"/>
+  </w:font>
+  <w:font w:name="Calibri Light">
+    <w:panose1 w:val="020F0302020204030204"/>
+    <w:charset w:val="00"/>
+    <w:family w:val="swiss"/>
+    <w:pitch w:val="variable"/>
+    <w:sig w:usb0="E4002EFF" w:usb1="C200247B" w:usb2="00000009" w:usb3="00000000" w:csb0="000001FF" w:csb1="00000000"/>
+  </w:font>
+</w:fonts>
+</file>
+
+<file path=word\numbering.xml><?xml version="1.0" encoding="utf-8"?>
 <w:numbering xmlns:wpc="http://schemas.microsoft.com/office/word/2010/wordprocessingCanvas" xmlns:cx="http://schemas.microsoft.com/office/drawing/2014/chartex" xmlns:cx1="http://schemas.microsoft.com/office/drawing/2015/9/8/chartex" xmlns:cx2="http://schemas.microsoft.com/office/drawing/2015/10/21/chartex" xmlns:cx3="http://schemas.microsoft.com/office/drawing/2016/5/9/chartex" xmlns:cx4="http://schemas.microsoft.com/office/drawing/2016/5/10/chartex" xmlns:cx5="http://schemas.microsoft.com/office/drawing/2016/5/11/chartex" xmlns:cx6="http://schemas.microsoft.com/office/drawing/2016/5/12/chartex" xmlns:cx7="http://schemas.microsoft.com/office/drawing/2016/5/13/chartex" xmlns:cx8="http://schemas.microsoft.com/office/drawing/2016/5/14/chartex" xmlns:mc="http://schemas.openxmlformats.org/markup-compatibility/2006" xmlns:aink="http://schemas.microsoft.com/office/drawing/2016/ink" xmlns:am3d="http://schemas.microsoft.com/office/drawing/2017/model3d" xmlns:o="urn:schemas-microsoft-com:office:office" xmlns:oel="http://schemas.microsoft.com/office/2019/extlst" xmlns:r="http://schemas.openxmlformats.org/officeDocument/2006/relationships" xmlns:m="http://schemas.openxmlformats.org/officeDocument/2006/math" xmlns:v="urn:schemas-microsoft-com:vml" xmlns:wp14="http://schemas.microsoft.com/office/word/2010/wordprocessingDrawing" xmlns:wp="http://schemas.openxmlformats.org/drawingml/2006/wordprocessingDrawing" xmlns:w10="urn:schemas-microsoft-com:office:word" xmlns:w="http://schemas.openxmlformats.org/wordprocessingml/2006/main" xmlns:w14="http://schemas.microsoft.com/office/word/2010/wordml" xmlns:w15="http://schemas.microsoft.com/office/word/2012/wordml" xmlns:w16cex="http://schemas.microsoft.com/office/word/2018/wordml/cex" xmlns:w16cid="http://schemas.microsoft.com/office/word/2016/wordml/cid" xmlns:w16="http://schemas.microsoft.com/office/word/2018/wordml" xmlns:w16du="http://schemas.microsoft.com/office/word/2023/wordml/word16du" xmlns:w16sdtdh="http://schemas.microsoft.com/office/word/2020/wordml/sdtdatahash" xmlns:w16sdtfl="http://schemas.microsoft.com/office/word/2024/wordml/sdtformatlock" xmlns:w16se="http://schemas.microsoft.com/office/word/2015/wordml/symex" xmlns:wpg="http://schemas.microsoft.com/office/word/2010/wordprocessingGroup" xmlns:wpi="http://schemas.microsoft.com/office/word/2010/wordprocessingInk" xmlns:wne="http://schemas.microsoft.com/office/word/2006/wordml" xmlns:wps="http://schemas.microsoft.com/office/word/2010/wordprocessingShape" mc:Ignorable="w14 w15 w16se w16cid w16 w16cex w16sdtdh w16sdtfl w16du wp14">
   <w:abstractNum w:abstractNumId="0" w15:restartNumberingAfterBreak="0">
     <w:nsid w:val="6FFA0C40"/>
@@ -1983,7 +2055,63 @@
 </w:numbering>
 </file>
 
-<file path=word/styles.xml><?xml version="1.0" encoding="utf-8"?>
+<file path=word\settings.xml><?xml version="1.0" encoding="utf-8"?>
+<w:settings xmlns:mc="http://schemas.openxmlformats.org/markup-compatibility/2006" xmlns:o="urn:schemas-microsoft-com:office:office" xmlns:r="http://schemas.openxmlformats.org/officeDocument/2006/relationships" xmlns:m="http://schemas.openxmlformats.org/officeDocument/2006/math" xmlns:v="urn:schemas-microsoft-com:vml" xmlns:w10="urn:schemas-microsoft-com:office:word" xmlns:w="http://schemas.openxmlformats.org/wordprocessingml/2006/main" xmlns:w14="http://schemas.microsoft.com/office/word/2010/wordml" xmlns:w15="http://schemas.microsoft.com/office/word/2012/wordml" xmlns:w16cex="http://schemas.microsoft.com/office/word/2018/wordml/cex" xmlns:w16cid="http://schemas.microsoft.com/office/word/2016/wordml/cid" xmlns:w16="http://schemas.microsoft.com/office/word/2018/wordml" xmlns:w16du="http://schemas.microsoft.com/office/word/2023/wordml/word16du" xmlns:w16sdtdh="http://schemas.microsoft.com/office/word/2020/wordml/sdtdatahash" xmlns:w16sdtfl="http://schemas.microsoft.com/office/word/2024/wordml/sdtformatlock" xmlns:w16se="http://schemas.microsoft.com/office/word/2015/wordml/symex" xmlns:sl="http://schemas.openxmlformats.org/schemaLibrary/2006/main" mc:Ignorable="w14 w15 w16se w16cid w16 w16cex w16sdtdh w16sdtfl w16du">
+  <w:zoom w:percent="120"/>
+  <w:doNotDisplayPageBoundaries/>
+  <w:displayBackgroundShape/>
+  <w:defaultTabStop w:val="708"/>
+  <w:hyphenationZone w:val="425"/>
+  <w:characterSpacingControl w:val="doNotCompress"/>
+  <w:compat>
+    <w:compatSetting w:name="compatibilityMode" w:uri="http://schemas.microsoft.com/office/word" w:val="15"/>
+    <w:compatSetting w:name="overrideTableStyleFontSizeAndJustification" w:uri="http://schemas.microsoft.com/office/word" w:val="1"/>
+    <w:compatSetting w:name="enableOpenTypeFeatures" w:uri="http://schemas.microsoft.com/office/word" w:val="1"/>
+    <w:compatSetting w:name="doNotFlipMirrorIndents" w:uri="http://schemas.microsoft.com/office/word" w:val="1"/>
+    <w:compatSetting w:name="differentiateMultirowTableHeaders" w:uri="http://schemas.microsoft.com/office/word" w:val="1"/>
+    <w:compatSetting w:name="useWord2013TrackBottomHyphenation" w:uri="http://schemas.microsoft.com/office/word" w:val="1"/>
+  </w:compat>
+  <w:rsids>
+    <w:rsidRoot w:val="00614C20"/>
+    <w:rsid w:val="00080060"/>
+    <w:rsid w:val="001961F4"/>
+    <w:rsid w:val="004B1CB4"/>
+    <w:rsid w:val="00614C20"/>
+    <w:rsid w:val="00861F7C"/>
+    <w:rsid w:val="0087645D"/>
+    <w:rsid w:val="00CF718F"/>
+    <w:rsid w:val="00FC102C"/>
+    <w:rsid w:val="00FE1EE3"/>
+  </w:rsids>
+  <m:mathPr>
+    <m:mathFont m:val="Cambria Math"/>
+    <m:brkBin m:val="before"/>
+    <m:brkBinSub m:val="--"/>
+    <m:smallFrac m:val="0"/>
+    <m:dispDef/>
+    <m:lMargin m:val="0"/>
+    <m:rMargin m:val="0"/>
+    <m:defJc m:val="centerGroup"/>
+    <m:wrapIndent m:val="1440"/>
+    <m:intLim m:val="subSup"/>
+    <m:naryLim m:val="undOvr"/>
+  </m:mathPr>
+  <w:themeFontLang w:val="es-ES"/>
+  <w:clrSchemeMapping w:bg1="light1" w:t1="dark1" w:bg2="light2" w:t2="dark2" w:accent1="accent1" w:accent2="accent2" w:accent3="accent3" w:accent4="accent4" w:accent5="accent5" w:accent6="accent6" w:hyperlink="hyperlink" w:followedHyperlink="followedHyperlink"/>
+  <w:shapeDefaults>
+    <o:shapedefaults v:ext="edit" spidmax="1026"/>
+    <o:shapelayout v:ext="edit">
+      <o:idmap v:ext="edit" data="1"/>
+    </o:shapelayout>
+  </w:shapeDefaults>
+  <w:decimalSymbol w:val=","/>
+  <w:listSeparator w:val=";"/>
+  <w14:docId w14:val="02C7C340"/>
+  <w15:docId w15:val="{680CE554-5DA7-4DC1-8584-1EC334130358}"/>
+</w:settings>
+</file>
+
+<file path=word\styles.xml><?xml version="1.0" encoding="utf-8"?>
 <w:styles xmlns:mc="http://schemas.openxmlformats.org/markup-compatibility/2006" xmlns:r="http://schemas.openxmlformats.org/officeDocument/2006/relationships" xmlns:w="http://schemas.openxmlformats.org/wordprocessingml/2006/main" xmlns:w14="http://schemas.microsoft.com/office/word/2010/wordml" xmlns:w15="http://schemas.microsoft.com/office/word/2012/wordml" xmlns:w16cex="http://schemas.microsoft.com/office/word/2018/wordml/cex" xmlns:w16cid="http://schemas.microsoft.com/office/word/2016/wordml/cid" xmlns:w16="http://schemas.microsoft.com/office/word/2018/wordml" xmlns:w16du="http://schemas.microsoft.com/office/word/2023/wordml/word16du" xmlns:w16sdtdh="http://schemas.microsoft.com/office/word/2020/wordml/sdtdatahash" xmlns:w16sdtfl="http://schemas.microsoft.com/office/word/2024/wordml/sdtformatlock" xmlns:w16se="http://schemas.microsoft.com/office/word/2015/wordml/symex" mc:Ignorable="w14 w15 w16se w16cid w16 w16cex w16sdtdh w16sdtfl w16du">
   <w:docDefaults>
     <w:rPrDefault>
@@ -2603,7 +2731,7 @@
 </w:styles>
 </file>
 
-<file path=word/theme/theme1.xml><?xml version="1.0" encoding="utf-8"?>
+<file path=word\theme\theme1.xml><?xml version="1.0" encoding="utf-8"?>
 <a:theme xmlns:a="http://schemas.openxmlformats.org/drawingml/2006/main" name="Office Theme">
   <a:themeElements>
     <a:clrScheme name="Office">
@@ -2891,4 +3019,8 @@
   <a:objectDefaults/>
   <a:extraClrSchemeLst/>
 </a:theme>
+</file>
+
+<file path=word\webSettings.xml><?xml version="1.0" encoding="utf-8"?>
+<w:webSettings xmlns:mc="http://schemas.openxmlformats.org/markup-compatibility/2006" xmlns:r="http://schemas.openxmlformats.org/officeDocument/2006/relationships" xmlns:w="http://schemas.openxmlformats.org/wordprocessingml/2006/main" xmlns:w14="http://schemas.microsoft.com/office/word/2010/wordml" xmlns:w15="http://schemas.microsoft.com/office/word/2012/wordml" xmlns:w16cex="http://schemas.microsoft.com/office/word/2018/wordml/cex" xmlns:w16cid="http://schemas.microsoft.com/office/word/2016/wordml/cid" xmlns:w16="http://schemas.microsoft.com/office/word/2018/wordml" xmlns:w16du="http://schemas.microsoft.com/office/word/2023/wordml/word16du" xmlns:w16sdtdh="http://schemas.microsoft.com/office/word/2020/wordml/sdtdatahash" xmlns:w16sdtfl="http://schemas.microsoft.com/office/word/2024/wordml/sdtformatlock" xmlns:w16se="http://schemas.microsoft.com/office/word/2015/wordml/symex" mc:Ignorable="w14 w15 w16se w16cid w16 w16cex w16sdtdh w16sdtfl w16du"/>
 </file>
</xml_diff>